<commit_message>
Update Actividad Notebook 03 Condicionales, Ciclos y Listas.docx
</commit_message>
<xml_diff>
--- a/NOTEBOOKS/Actividad Notebook 03 Condicionales, Ciclos y Listas.docx
+++ b/NOTEBOOKS/Actividad Notebook 03 Condicionales, Ciclos y Listas.docx
@@ -128,7 +128,7 @@
           <w:sz w:val="28"/>
           <w:szCs w:val="20"/>
         </w:rPr>
-        <w:t>NOTEBOOK 0</w:t>
+        <w:t xml:space="preserve">NOTEBOOK </w:t>
       </w:r>
       <w:r>
         <w:rPr>
@@ -137,7 +137,7 @@
           <w:sz w:val="28"/>
           <w:szCs w:val="20"/>
         </w:rPr>
-        <w:t>2</w:t>
+        <w:t xml:space="preserve">03 - </w:t>
       </w:r>
       <w:r>
         <w:rPr>
@@ -146,34 +146,7 @@
           <w:sz w:val="28"/>
           <w:szCs w:val="20"/>
         </w:rPr>
-        <w:t xml:space="preserve"> </w:t>
-      </w:r>
-      <w:r>
-        <w:rPr>
-          <w:b/>
-          <w:bCs/>
-          <w:sz w:val="28"/>
-          <w:szCs w:val="20"/>
-        </w:rPr>
-        <w:t>–</w:t>
-      </w:r>
-      <w:r>
-        <w:rPr>
-          <w:b/>
-          <w:bCs/>
-          <w:sz w:val="28"/>
-          <w:szCs w:val="20"/>
-        </w:rPr>
-        <w:t xml:space="preserve"> </w:t>
-      </w:r>
-      <w:r>
-        <w:rPr>
-          <w:b/>
-          <w:bCs/>
-          <w:sz w:val="28"/>
-          <w:szCs w:val="20"/>
-        </w:rPr>
-        <w:t>Variables para el Análisis de Datos</w:t>
+        <w:t>Condicionales, Ciclos y Listas</w:t>
       </w:r>
     </w:p>
     <w:p>
@@ -243,7 +216,7 @@
             <w:sz w:val="28"/>
             <w:szCs w:val="20"/>
           </w:rPr>
-          <w:t>https://github.com/Melany-Morales/2026C2-G03-PROGRAMACI-N/blob/main/NOTEBOOKS/NOTEBOOK%2002%20-%20Variables%20para%20el%20Analisis%20de%20Datos.ipynb</w:t>
+          <w:t>https://github.com/Melany-Morales/2026C2-G03-PROGRAMACI-N/blob/main/NOTEBOOKS/Actividad%20Notebook%2003%20Condicionales%2C%20Ciclos%20y%20Listas.docx</w:t>
         </w:r>
       </w:hyperlink>
       <w:r>
@@ -464,7 +437,79 @@
           <w:lang w:val="en-US" w:eastAsia="en-US"/>
           <w14:ligatures w14:val="none"/>
         </w:rPr>
-        <w:t>El repositorio debe incluir:</w:t>
+        <w:t xml:space="preserve">El </w:t>
+      </w:r>
+      <w:proofErr w:type="spellStart"/>
+      <w:r>
+        <w:rPr>
+          <w:rFonts w:asciiTheme="minorHAnsi" w:eastAsia="Times New Roman" w:hAnsiTheme="minorHAnsi" w:cs="Times New Roman"/>
+          <w:color w:val="auto"/>
+          <w:kern w:val="0"/>
+          <w:sz w:val="24"/>
+          <w:lang w:val="en-US" w:eastAsia="en-US"/>
+          <w14:ligatures w14:val="none"/>
+        </w:rPr>
+        <w:t>repositorio</w:t>
+      </w:r>
+      <w:proofErr w:type="spellEnd"/>
+      <w:r>
+        <w:rPr>
+          <w:rFonts w:asciiTheme="minorHAnsi" w:eastAsia="Times New Roman" w:hAnsiTheme="minorHAnsi" w:cs="Times New Roman"/>
+          <w:color w:val="auto"/>
+          <w:kern w:val="0"/>
+          <w:sz w:val="24"/>
+          <w:lang w:val="en-US" w:eastAsia="en-US"/>
+          <w14:ligatures w14:val="none"/>
+        </w:rPr>
+        <w:t xml:space="preserve"> </w:t>
+      </w:r>
+      <w:proofErr w:type="spellStart"/>
+      <w:r>
+        <w:rPr>
+          <w:rFonts w:asciiTheme="minorHAnsi" w:eastAsia="Times New Roman" w:hAnsiTheme="minorHAnsi" w:cs="Times New Roman"/>
+          <w:color w:val="auto"/>
+          <w:kern w:val="0"/>
+          <w:sz w:val="24"/>
+          <w:lang w:val="en-US" w:eastAsia="en-US"/>
+          <w14:ligatures w14:val="none"/>
+        </w:rPr>
+        <w:t>debe</w:t>
+      </w:r>
+      <w:proofErr w:type="spellEnd"/>
+      <w:r>
+        <w:rPr>
+          <w:rFonts w:asciiTheme="minorHAnsi" w:eastAsia="Times New Roman" w:hAnsiTheme="minorHAnsi" w:cs="Times New Roman"/>
+          <w:color w:val="auto"/>
+          <w:kern w:val="0"/>
+          <w:sz w:val="24"/>
+          <w:lang w:val="en-US" w:eastAsia="en-US"/>
+          <w14:ligatures w14:val="none"/>
+        </w:rPr>
+        <w:t xml:space="preserve"> </w:t>
+      </w:r>
+      <w:proofErr w:type="spellStart"/>
+      <w:r>
+        <w:rPr>
+          <w:rFonts w:asciiTheme="minorHAnsi" w:eastAsia="Times New Roman" w:hAnsiTheme="minorHAnsi" w:cs="Times New Roman"/>
+          <w:color w:val="auto"/>
+          <w:kern w:val="0"/>
+          <w:sz w:val="24"/>
+          <w:lang w:val="en-US" w:eastAsia="en-US"/>
+          <w14:ligatures w14:val="none"/>
+        </w:rPr>
+        <w:t>incluir</w:t>
+      </w:r>
+      <w:proofErr w:type="spellEnd"/>
+      <w:r>
+        <w:rPr>
+          <w:rFonts w:asciiTheme="minorHAnsi" w:eastAsia="Times New Roman" w:hAnsiTheme="minorHAnsi" w:cs="Times New Roman"/>
+          <w:color w:val="auto"/>
+          <w:kern w:val="0"/>
+          <w:sz w:val="24"/>
+          <w:lang w:val="en-US" w:eastAsia="en-US"/>
+          <w14:ligatures w14:val="none"/>
+        </w:rPr>
+        <w:t>:</w:t>
       </w:r>
     </w:p>
     <w:p>
@@ -483,7 +528,6 @@
           <w14:ligatures w14:val="none"/>
         </w:rPr>
       </w:pPr>
-      <w:proofErr w:type="gramStart"/>
       <w:r>
         <w:rPr>
           <w:rFonts w:asciiTheme="minorHAnsi" w:eastAsia="Times New Roman" w:hAnsiTheme="minorHAnsi" w:cs="Times New Roman"/>
@@ -504,9 +548,21 @@
           <w:lang w:val="es-CR" w:eastAsia="en-US"/>
           <w14:ligatures w14:val="none"/>
         </w:rPr>
-        <w:t>.ipynb</w:t>
-      </w:r>
-      <w:proofErr w:type="gramEnd"/>
+        <w:t>.</w:t>
+      </w:r>
+      <w:proofErr w:type="spellStart"/>
+      <w:r>
+        <w:rPr>
+          <w:rFonts w:ascii="Consolas" w:eastAsia="Times New Roman" w:hAnsi="Consolas" w:cs="Times New Roman"/>
+          <w:color w:val="auto"/>
+          <w:kern w:val="0"/>
+          <w:sz w:val="22"/>
+          <w:lang w:val="es-CR" w:eastAsia="en-US"/>
+          <w14:ligatures w14:val="none"/>
+        </w:rPr>
+        <w:t>ipynb</w:t>
+      </w:r>
+      <w:proofErr w:type="spellEnd"/>
       <w:r>
         <w:rPr>
           <w:rFonts w:asciiTheme="minorHAnsi" w:eastAsia="Times New Roman" w:hAnsiTheme="minorHAnsi" w:cs="Times New Roman"/>
@@ -535,6 +591,7 @@
           <w14:ligatures w14:val="none"/>
         </w:rPr>
       </w:pPr>
+      <w:proofErr w:type="spellStart"/>
       <w:r>
         <w:rPr>
           <w:rFonts w:asciiTheme="minorHAnsi" w:eastAsia="Times New Roman" w:hAnsiTheme="minorHAnsi" w:cs="Times New Roman"/>
@@ -544,7 +601,67 @@
           <w:lang w:val="en-US" w:eastAsia="en-US"/>
           <w14:ligatures w14:val="none"/>
         </w:rPr>
-        <w:t>Respuestas y ejercicios desarrollados.</w:t>
+        <w:t>Respuestas</w:t>
+      </w:r>
+      <w:proofErr w:type="spellEnd"/>
+      <w:r>
+        <w:rPr>
+          <w:rFonts w:asciiTheme="minorHAnsi" w:eastAsia="Times New Roman" w:hAnsiTheme="minorHAnsi" w:cs="Times New Roman"/>
+          <w:color w:val="auto"/>
+          <w:kern w:val="0"/>
+          <w:sz w:val="24"/>
+          <w:lang w:val="en-US" w:eastAsia="en-US"/>
+          <w14:ligatures w14:val="none"/>
+        </w:rPr>
+        <w:t xml:space="preserve"> y </w:t>
+      </w:r>
+      <w:proofErr w:type="spellStart"/>
+      <w:r>
+        <w:rPr>
+          <w:rFonts w:asciiTheme="minorHAnsi" w:eastAsia="Times New Roman" w:hAnsiTheme="minorHAnsi" w:cs="Times New Roman"/>
+          <w:color w:val="auto"/>
+          <w:kern w:val="0"/>
+          <w:sz w:val="24"/>
+          <w:lang w:val="en-US" w:eastAsia="en-US"/>
+          <w14:ligatures w14:val="none"/>
+        </w:rPr>
+        <w:t>ejercicios</w:t>
+      </w:r>
+      <w:proofErr w:type="spellEnd"/>
+      <w:r>
+        <w:rPr>
+          <w:rFonts w:asciiTheme="minorHAnsi" w:eastAsia="Times New Roman" w:hAnsiTheme="minorHAnsi" w:cs="Times New Roman"/>
+          <w:color w:val="auto"/>
+          <w:kern w:val="0"/>
+          <w:sz w:val="24"/>
+          <w:lang w:val="en-US" w:eastAsia="en-US"/>
+          <w14:ligatures w14:val="none"/>
+        </w:rPr>
+        <w:t xml:space="preserve"> </w:t>
+      </w:r>
+      <w:proofErr w:type="spellStart"/>
+      <w:r>
+        <w:rPr>
+          <w:rFonts w:asciiTheme="minorHAnsi" w:eastAsia="Times New Roman" w:hAnsiTheme="minorHAnsi" w:cs="Times New Roman"/>
+          <w:color w:val="auto"/>
+          <w:kern w:val="0"/>
+          <w:sz w:val="24"/>
+          <w:lang w:val="en-US" w:eastAsia="en-US"/>
+          <w14:ligatures w14:val="none"/>
+        </w:rPr>
+        <w:t>desarrollados</w:t>
+      </w:r>
+      <w:proofErr w:type="spellEnd"/>
+      <w:r>
+        <w:rPr>
+          <w:rFonts w:asciiTheme="minorHAnsi" w:eastAsia="Times New Roman" w:hAnsiTheme="minorHAnsi" w:cs="Times New Roman"/>
+          <w:color w:val="auto"/>
+          <w:kern w:val="0"/>
+          <w:sz w:val="24"/>
+          <w:lang w:val="en-US" w:eastAsia="en-US"/>
+          <w14:ligatures w14:val="none"/>
+        </w:rPr>
+        <w:t>.</w:t>
       </w:r>
     </w:p>
     <w:p>
@@ -598,7 +715,7 @@
           <w14:ligatures w14:val="none"/>
         </w:rPr>
         <w:pict w14:anchorId="04B911BC">
-          <v:rect id="_x0000_i1028" style="width:0;height:1.5pt" o:hralign="center" o:hrstd="t" o:hr="t" stroked="f"/>
+          <v:rect id="_x0000_i1027" style="width:0;height:1.5pt" o:hralign="center" o:hrstd="t" o:hr="t" stroked="f"/>
         </w:pict>
       </w:r>
     </w:p>

</xml_diff>